<commit_message>
Cross-link the docs, add the example analysis to the README table
</commit_message>
<xml_diff>
--- a/rnaseq-flow_User_Guide.docx
+++ b/rnaseq-flow_User_Guide.docx
@@ -182,6 +182,21 @@
     </w:p>
     <w:p>
       <w:pPr>
+        <w:spacing w:after="120"/>
+      </w:pPr>
+      <w:r>
+        <w:rPr>
+          <w:b/>
+          <w:bCs/>
+        </w:rPr>
+        <w:t xml:space="preserve">If you would rather follow a worked example than read a reference, </w:t>
+      </w:r>
+      <w:r>
+        <w:t xml:space="preserve">rnaseq-flow_Example_Analysis.md in the repository takes a real public dataset from download to results in under an hour and ends with a biological signature you can check your setup against. Section 11 lists the other documents.</w:t>
+      </w:r>
+    </w:p>
+    <w:p>
+      <w:pPr>
         <w:pStyle w:val="Heading2"/>
       </w:pPr>
       <w:r>
@@ -12051,6 +12066,489 @@
           <w:iCs w:val="false"/>
         </w:rPr>
         <w:t xml:space="preserve">Execution reports in &lt;outdir&gt;/pipeline_info/ show which process failed and why. After editing the pipeline, re-validate its structure with nextflow run ... -stub-run.</w:t>
+      </w:r>
+    </w:p>
+    <w:p>
+      <w:pPr>
+        <w:pStyle w:val="Heading1"/>
+      </w:pPr>
+      <w:r>
+        <w:t xml:space="preserve">11. Further reading</w:t>
+      </w:r>
+    </w:p>
+    <w:p>
+      <w:pPr>
+        <w:spacing w:after="120"/>
+      </w:pPr>
+      <w:r>
+        <w:rPr>
+          <w:b w:val="false"/>
+          <w:bCs w:val="false"/>
+          <w:i w:val="false"/>
+          <w:iCs w:val="false"/>
+        </w:rPr>
+        <w:t xml:space="preserve">This guide is generated from the pipeline repository and travels well on its own. The documents below live at the top level of that repository, and each is the authoritative version of what is summarised here.</w:t>
+      </w:r>
+    </w:p>
+    <w:tbl>
+      <w:tblPr>
+        <w:tblW w:type="dxa" w:w="9360"/>
+        <w:tblBorders>
+          <w:top w:val="single" w:color="auto" w:sz="4"/>
+          <w:left w:val="single" w:color="auto" w:sz="4"/>
+          <w:bottom w:val="single" w:color="auto" w:sz="4"/>
+          <w:right w:val="single" w:color="auto" w:sz="4"/>
+          <w:insideH w:val="single" w:color="auto" w:sz="4"/>
+          <w:insideV w:val="single" w:color="auto" w:sz="4"/>
+        </w:tblBorders>
+      </w:tblPr>
+      <w:tblGrid>
+        <w:gridCol w:w="3400"/>
+        <w:gridCol w:w="5960"/>
+      </w:tblGrid>
+      <w:tr>
+        <w:trPr>
+          <w:tblHeader/>
+        </w:trPr>
+        <w:tc>
+          <w:tcPr>
+            <w:tcW w:type="dxa" w:w="3400"/>
+            <w:shd w:fill="1F4E79" w:val="clear"/>
+            <w:tcMar>
+              <w:top w:type="dxa" w:w="60"/>
+              <w:left w:type="dxa" w:w="110"/>
+              <w:bottom w:type="dxa" w:w="60"/>
+              <w:right w:type="dxa" w:w="110"/>
+            </w:tcMar>
+          </w:tcPr>
+          <w:p>
+            <w:r>
+              <w:rPr>
+                <w:b/>
+                <w:bCs/>
+                <w:color w:val="FFFFFF"/>
+                <w:sz w:val="19"/>
+                <w:szCs w:val="19"/>
+              </w:rPr>
+              <w:t xml:space="preserve">Document</w:t>
+            </w:r>
+          </w:p>
+        </w:tc>
+        <w:tc>
+          <w:tcPr>
+            <w:tcW w:type="dxa" w:w="5960"/>
+            <w:shd w:fill="1F4E79" w:val="clear"/>
+            <w:tcMar>
+              <w:top w:type="dxa" w:w="60"/>
+              <w:left w:type="dxa" w:w="110"/>
+              <w:bottom w:type="dxa" w:w="60"/>
+              <w:right w:type="dxa" w:w="110"/>
+            </w:tcMar>
+          </w:tcPr>
+          <w:p>
+            <w:r>
+              <w:rPr>
+                <w:b/>
+                <w:bCs/>
+                <w:color w:val="FFFFFF"/>
+                <w:sz w:val="19"/>
+                <w:szCs w:val="19"/>
+              </w:rPr>
+              <w:t xml:space="preserve">What it adds</w:t>
+            </w:r>
+          </w:p>
+        </w:tc>
+      </w:tr>
+      <w:tr>
+        <w:trPr>
+          <w:tblHeader w:val="false"/>
+        </w:trPr>
+        <w:tc>
+          <w:tcPr>
+            <w:tcW w:type="dxa" w:w="3400"/>
+            <w:shd w:fill="FFFFFF" w:val="clear"/>
+            <w:tcMar>
+              <w:top w:type="dxa" w:w="60"/>
+              <w:left w:type="dxa" w:w="110"/>
+              <w:bottom w:type="dxa" w:w="60"/>
+              <w:right w:type="dxa" w:w="110"/>
+            </w:tcMar>
+          </w:tcPr>
+          <w:p>
+            <w:r>
+              <w:rPr>
+                <w:b w:val="false"/>
+                <w:bCs w:val="false"/>
+                <w:color w:val="000000"/>
+                <w:sz w:val="19"/>
+                <w:szCs w:val="19"/>
+              </w:rPr>
+              <w:t xml:space="preserve">rnaseq-flow_Example_Analysis.md</w:t>
+            </w:r>
+          </w:p>
+        </w:tc>
+        <w:tc>
+          <w:tcPr>
+            <w:tcW w:type="dxa" w:w="5960"/>
+            <w:shd w:fill="FFFFFF" w:val="clear"/>
+            <w:tcMar>
+              <w:top w:type="dxa" w:w="60"/>
+              <w:left w:type="dxa" w:w="110"/>
+              <w:bottom w:type="dxa" w:w="60"/>
+              <w:right w:type="dxa" w:w="110"/>
+            </w:tcMar>
+          </w:tcPr>
+          <w:p>
+            <w:r>
+              <w:rPr>
+                <w:b w:val="false"/>
+                <w:bCs w:val="false"/>
+                <w:color w:val="000000"/>
+                <w:sz w:val="19"/>
+                <w:szCs w:val="19"/>
+              </w:rPr>
+              <w:t xml:space="preserve">A complete worked example on a public dataset (GSE151251), from FASTQ download through to results, ending in an expected biological signature you can check your own setup against. The best way to confirm an installation works</w:t>
+            </w:r>
+          </w:p>
+        </w:tc>
+      </w:tr>
+      <w:tr>
+        <w:trPr>
+          <w:tblHeader w:val="false"/>
+        </w:trPr>
+        <w:tc>
+          <w:tcPr>
+            <w:tcW w:type="dxa" w:w="3400"/>
+            <w:shd w:fill="FFFFFF" w:val="clear"/>
+            <w:tcMar>
+              <w:top w:type="dxa" w:w="60"/>
+              <w:left w:type="dxa" w:w="110"/>
+              <w:bottom w:type="dxa" w:w="60"/>
+              <w:right w:type="dxa" w:w="110"/>
+            </w:tcMar>
+          </w:tcPr>
+          <w:p>
+            <w:r>
+              <w:rPr>
+                <w:b w:val="false"/>
+                <w:bCs w:val="false"/>
+                <w:color w:val="000000"/>
+                <w:sz w:val="19"/>
+                <w:szCs w:val="19"/>
+              </w:rPr>
+              <w:t xml:space="preserve">README.md</w:t>
+            </w:r>
+          </w:p>
+        </w:tc>
+        <w:tc>
+          <w:tcPr>
+            <w:tcW w:type="dxa" w:w="5960"/>
+            <w:shd w:fill="FFFFFF" w:val="clear"/>
+            <w:tcMar>
+              <w:top w:type="dxa" w:w="60"/>
+              <w:left w:type="dxa" w:w="110"/>
+              <w:bottom w:type="dxa" w:w="60"/>
+              <w:right w:type="dxa" w:w="110"/>
+            </w:tcMar>
+          </w:tcPr>
+          <w:p>
+            <w:r>
+              <w:rPr>
+                <w:b w:val="false"/>
+                <w:bCs w:val="false"/>
+                <w:color w:val="000000"/>
+                <w:sz w:val="19"/>
+                <w:szCs w:val="19"/>
+              </w:rPr>
+              <w:t xml:space="preserve">Overview, quick start and the full parameter reference</w:t>
+            </w:r>
+          </w:p>
+        </w:tc>
+      </w:tr>
+      <w:tr>
+        <w:trPr>
+          <w:tblHeader w:val="false"/>
+        </w:trPr>
+        <w:tc>
+          <w:tcPr>
+            <w:tcW w:type="dxa" w:w="3400"/>
+            <w:shd w:fill="FFFFFF" w:val="clear"/>
+            <w:tcMar>
+              <w:top w:type="dxa" w:w="60"/>
+              <w:left w:type="dxa" w:w="110"/>
+              <w:bottom w:type="dxa" w:w="60"/>
+              <w:right w:type="dxa" w:w="110"/>
+            </w:tcMar>
+          </w:tcPr>
+          <w:p>
+            <w:r>
+              <w:rPr>
+                <w:b w:val="false"/>
+                <w:bCs w:val="false"/>
+                <w:color w:val="000000"/>
+                <w:sz w:val="19"/>
+                <w:szCs w:val="19"/>
+              </w:rPr>
+              <w:t xml:space="preserve">USAGE.md</w:t>
+            </w:r>
+          </w:p>
+        </w:tc>
+        <w:tc>
+          <w:tcPr>
+            <w:tcW w:type="dxa" w:w="5960"/>
+            <w:shd w:fill="FFFFFF" w:val="clear"/>
+            <w:tcMar>
+              <w:top w:type="dxa" w:w="60"/>
+              <w:left w:type="dxa" w:w="110"/>
+              <w:bottom w:type="dxa" w:w="60"/>
+              <w:right w:type="dxa" w:w="110"/>
+            </w:tcMar>
+          </w:tcPr>
+          <w:p>
+            <w:r>
+              <w:rPr>
+                <w:b w:val="false"/>
+                <w:bCs w:val="false"/>
+                <w:color w:val="000000"/>
+                <w:sz w:val="19"/>
+                <w:szCs w:val="19"/>
+              </w:rPr>
+              <w:t xml:space="preserve">The long-form version of sections 4 to 7 here, including cluster execution, resource tuning and troubleshooting</w:t>
+            </w:r>
+          </w:p>
+        </w:tc>
+      </w:tr>
+      <w:tr>
+        <w:trPr>
+          <w:tblHeader w:val="false"/>
+        </w:trPr>
+        <w:tc>
+          <w:tcPr>
+            <w:tcW w:type="dxa" w:w="3400"/>
+            <w:shd w:fill="FFFFFF" w:val="clear"/>
+            <w:tcMar>
+              <w:top w:type="dxa" w:w="60"/>
+              <w:left w:type="dxa" w:w="110"/>
+              <w:bottom w:type="dxa" w:w="60"/>
+              <w:right w:type="dxa" w:w="110"/>
+            </w:tcMar>
+          </w:tcPr>
+          <w:p>
+            <w:r>
+              <w:rPr>
+                <w:b w:val="false"/>
+                <w:bCs w:val="false"/>
+                <w:color w:val="000000"/>
+                <w:sz w:val="19"/>
+                <w:szCs w:val="19"/>
+              </w:rPr>
+              <w:t xml:space="preserve">OUTPUTS.md</w:t>
+            </w:r>
+          </w:p>
+        </w:tc>
+        <w:tc>
+          <w:tcPr>
+            <w:tcW w:type="dxa" w:w="5960"/>
+            <w:shd w:fill="FFFFFF" w:val="clear"/>
+            <w:tcMar>
+              <w:top w:type="dxa" w:w="60"/>
+              <w:left w:type="dxa" w:w="110"/>
+              <w:bottom w:type="dxa" w:w="60"/>
+              <w:right w:type="dxa" w:w="110"/>
+            </w:tcMar>
+          </w:tcPr>
+          <w:p>
+            <w:r>
+              <w:rPr>
+                <w:b w:val="false"/>
+                <w:bCs w:val="false"/>
+                <w:color w:val="000000"/>
+                <w:sz w:val="19"/>
+                <w:szCs w:val="19"/>
+              </w:rPr>
+              <w:t xml:space="preserve">The long-form version of section 8, file by file</w:t>
+            </w:r>
+          </w:p>
+        </w:tc>
+      </w:tr>
+      <w:tr>
+        <w:trPr>
+          <w:tblHeader w:val="false"/>
+        </w:trPr>
+        <w:tc>
+          <w:tcPr>
+            <w:tcW w:type="dxa" w:w="3400"/>
+            <w:shd w:fill="FFFFFF" w:val="clear"/>
+            <w:tcMar>
+              <w:top w:type="dxa" w:w="60"/>
+              <w:left w:type="dxa" w:w="110"/>
+              <w:bottom w:type="dxa" w:w="60"/>
+              <w:right w:type="dxa" w:w="110"/>
+            </w:tcMar>
+          </w:tcPr>
+          <w:p>
+            <w:r>
+              <w:rPr>
+                <w:b w:val="false"/>
+                <w:bCs w:val="false"/>
+                <w:color w:val="000000"/>
+                <w:sz w:val="19"/>
+                <w:szCs w:val="19"/>
+              </w:rPr>
+              <w:t xml:space="preserve">CITATIONS.md</w:t>
+            </w:r>
+          </w:p>
+        </w:tc>
+        <w:tc>
+          <w:tcPr>
+            <w:tcW w:type="dxa" w:w="5960"/>
+            <w:shd w:fill="FFFFFF" w:val="clear"/>
+            <w:tcMar>
+              <w:top w:type="dxa" w:w="60"/>
+              <w:left w:type="dxa" w:w="110"/>
+              <w:bottom w:type="dxa" w:w="60"/>
+              <w:right w:type="dxa" w:w="110"/>
+            </w:tcMar>
+          </w:tcPr>
+          <w:p>
+            <w:r>
+              <w:rPr>
+                <w:b w:val="false"/>
+                <w:bCs w:val="false"/>
+                <w:color w:val="000000"/>
+                <w:sz w:val="19"/>
+                <w:szCs w:val="19"/>
+              </w:rPr>
+              <w:t xml:space="preserve">The publication to cite for every tool, and a methods paragraph to adapt for a manuscript</w:t>
+            </w:r>
+          </w:p>
+        </w:tc>
+      </w:tr>
+      <w:tr>
+        <w:trPr>
+          <w:tblHeader w:val="false"/>
+        </w:trPr>
+        <w:tc>
+          <w:tcPr>
+            <w:tcW w:type="dxa" w:w="3400"/>
+            <w:shd w:fill="FFFFFF" w:val="clear"/>
+            <w:tcMar>
+              <w:top w:type="dxa" w:w="60"/>
+              <w:left w:type="dxa" w:w="110"/>
+              <w:bottom w:type="dxa" w:w="60"/>
+              <w:right w:type="dxa" w:w="110"/>
+            </w:tcMar>
+          </w:tcPr>
+          <w:p>
+            <w:r>
+              <w:rPr>
+                <w:b w:val="false"/>
+                <w:bCs w:val="false"/>
+                <w:color w:val="000000"/>
+                <w:sz w:val="19"/>
+                <w:szCs w:val="19"/>
+              </w:rPr>
+              <w:t xml:space="preserve">CHANGELOG.md</w:t>
+            </w:r>
+          </w:p>
+        </w:tc>
+        <w:tc>
+          <w:tcPr>
+            <w:tcW w:type="dxa" w:w="5960"/>
+            <w:shd w:fill="FFFFFF" w:val="clear"/>
+            <w:tcMar>
+              <w:top w:type="dxa" w:w="60"/>
+              <w:left w:type="dxa" w:w="110"/>
+              <w:bottom w:type="dxa" w:w="60"/>
+              <w:right w:type="dxa" w:w="110"/>
+            </w:tcMar>
+          </w:tcPr>
+          <w:p>
+            <w:r>
+              <w:rPr>
+                <w:b w:val="false"/>
+                <w:bCs w:val="false"/>
+                <w:color w:val="000000"/>
+                <w:sz w:val="19"/>
+                <w:szCs w:val="19"/>
+              </w:rPr>
+              <w:t xml:space="preserve">What changed in each release, and what breaks</w:t>
+            </w:r>
+          </w:p>
+        </w:tc>
+      </w:tr>
+      <w:tr>
+        <w:trPr>
+          <w:tblHeader w:val="false"/>
+        </w:trPr>
+        <w:tc>
+          <w:tcPr>
+            <w:tcW w:type="dxa" w:w="3400"/>
+            <w:shd w:fill="FFFFFF" w:val="clear"/>
+            <w:tcMar>
+              <w:top w:type="dxa" w:w="60"/>
+              <w:left w:type="dxa" w:w="110"/>
+              <w:bottom w:type="dxa" w:w="60"/>
+              <w:right w:type="dxa" w:w="110"/>
+            </w:tcMar>
+          </w:tcPr>
+          <w:p>
+            <w:r>
+              <w:rPr>
+                <w:b w:val="false"/>
+                <w:bCs w:val="false"/>
+                <w:color w:val="000000"/>
+                <w:sz w:val="19"/>
+                <w:szCs w:val="19"/>
+              </w:rPr>
+              <w:t xml:space="preserve">overview.html</w:t>
+            </w:r>
+          </w:p>
+        </w:tc>
+        <w:tc>
+          <w:tcPr>
+            <w:tcW w:type="dxa" w:w="5960"/>
+            <w:shd w:fill="FFFFFF" w:val="clear"/>
+            <w:tcMar>
+              <w:top w:type="dxa" w:w="60"/>
+              <w:left w:type="dxa" w:w="110"/>
+              <w:bottom w:type="dxa" w:w="60"/>
+              <w:right w:type="dxa" w:w="110"/>
+            </w:tcMar>
+          </w:tcPr>
+          <w:p>
+            <w:r>
+              <w:rPr>
+                <w:b w:val="false"/>
+                <w:bCs w:val="false"/>
+                <w:color w:val="000000"/>
+                <w:sz w:val="19"/>
+                <w:szCs w:val="19"/>
+              </w:rPr>
+              <w:t xml:space="preserve">The workflow as an interactive diagram: a DAG view and a metro-map view</w:t>
+            </w:r>
+          </w:p>
+        </w:tc>
+      </w:tr>
+    </w:tbl>
+    <w:p>
+      <w:pPr>
+        <w:spacing w:after="80"/>
+      </w:pPr>
+    </w:p>
+    <w:p>
+      <w:pPr>
+        <w:spacing w:after="120"/>
+      </w:pPr>
+      <w:r>
+        <w:rPr>
+          <w:b/>
+          <w:bCs/>
+        </w:rPr>
+        <w:t xml:space="preserve">This document is generated. </w:t>
+      </w:r>
+      <w:r>
+        <w:t xml:space="preserve">It is built from docs/build_user_guide.js in the repository, so edits made in Word are lost the next time it is rebuilt. Change the generator instead. The version on the title page is read from the pipeline manifest, so it always matches the release it documents.</w:t>
       </w:r>
     </w:p>
     <w:sectPr>

</xml_diff>

<commit_message>
Bring the citations page and the Word guide to 1.7.0
Two documents the version bump missed, found by auditing every user-facing
file rather than the ones I had edited.

CITATIONS.html still gave v1.6.0 in its methods paragraph. CITATIONS.md was
updated and the styled HTML copy of it was not. Neither quotes tool versions,
both point at software_versions_mqc.yml, so the pipeline version was the only
thing wrong.

rnaseq-flow_User_Guide.docx was built on 12 September and still described the
v1.5.1 bundle. Regenerated from docs/build_user_guide.js, which itself needed
the bundle reference moving to v1.7.0 and the claim that an older bundle covers
the current release replaced, since that is no longer true. The three remaining
mentions of 1.6.0 in the guide are the rMATS sign-convention history and stay.

The generator is gitignored, so the regenerated .docx carries the change.
</commit_message>
<xml_diff>
--- a/rnaseq-flow_User_Guide.docx
+++ b/rnaseq-flow_User_Guide.docx
@@ -88,7 +88,7 @@
           <w:sz w:val="24"/>
           <w:szCs w:val="24"/>
         </w:rPr>
-        <w:t xml:space="preserve">Version 1.6.0</w:t>
+        <w:t xml:space="preserve">Version 1.7.0</w:t>
       </w:r>
     </w:p>
     <w:p>
@@ -5125,7 +5125,7 @@
         <w:t xml:space="preserve">Running without internet access. </w:t>
       </w:r>
       <w:r>
-        <w:t xml:space="preserve">Trusted Research Environments, secure enclaves and air-gapped HPC block outbound network access, and the pipeline will not run there as configured: Wave provisions several containers on the fly by contacting an external service at run time. It has to be switched off and every image supplied locally. A prepared bundle of all 27 Singularity images (about 7 GB), with a tre.config profile and a README, is published on Zenodo at https://doi.org/10.5281/zenodo.21880329. Download it outside the TRE, verify it with sha256sum -c against the published checksum, transfer it in, then:</w:t>
+        <w:t xml:space="preserve">Trusted Research Environments, secure enclaves and air-gapped HPC block outbound network access, and the pipeline will not run there as configured: Wave provisions several containers on the fly by contacting an external service at run time. It has to be switched off and every image supplied locally. A prepared bundle of all 27 Singularity images (about 7 GB), with a tre.config profile and a README, is published on Zenodo at https://doi.org/10.5281/zenodo.21880328, a concept DOI that resolves to the most recent bundle. Download it outside the TRE, verify it with sha256sum -c against the published checksum, transfer it in, then:</w:t>
       </w:r>
     </w:p>
     <w:p>
@@ -5140,7 +5140,7 @@
           <w:sz w:val="19"/>
           <w:szCs w:val="19"/>
         </w:rPr>
-        <w:t xml:space="preserve">tar -xf rnaseq-flow-1.5.1-singularity.tar</w:t>
+        <w:t xml:space="preserve">tar -xf rnaseq-flow-1.7.0-singularity.tar</w:t>
       </w:r>
     </w:p>
     <w:p>
@@ -5155,7 +5155,7 @@
           <w:sz w:val="19"/>
           <w:szCs w:val="19"/>
         </w:rPr>
-        <w:t xml:space="preserve">export NXF_SINGULARITY_CACHEDIR=$PWD/singularity-1.5.1</w:t>
+        <w:t xml:space="preserve">export NXF_SINGULARITY_CACHEDIR=$PWD/singularity-1.7.0</w:t>
       </w:r>
     </w:p>
     <w:p>
@@ -5279,7 +5279,7 @@
         <w:t xml:space="preserve">Note  </w:t>
       </w:r>
       <w:r>
-        <w:t xml:space="preserve">The bundle is pinned to a release, and the 1.5.1 bundle covers 1.6.0: no container reference changed between the two, so there is nothing new to download. A genuine mismatch surfaces as a process failing to find its image, not as a version error. The bundle carries software, not data: run --download_refs and --download_gmt outside the TRE and transfer the reference directory in alongside it, keeping reference_metadata.json with the files. Do not use -profile conda in a TRE; it resolves environments at run time and needs reachable channels.</w:t>
+        <w:t xml:space="preserve">The bundle is pinned to a release, and v1.7.0 is the current one. Earlier bundles do not work with it: 1.7.0 moved every Bioconductor package to release 3.22, so both the container references and the Conda specs changed. A mismatch surfaces as a process failing to find its image, not as a version error. The bundle also carries the nf-prov plugin: copy it into ~/.nextflow/plugins and set NXF_OFFLINE=true, or the run fails with no network to fetch it. The bundle carries software, not data: run --download_refs and --download_gmt outside the TRE and transfer the reference directory in alongside it, keeping reference_metadata.json with the files. Do not use -profile conda in a TRE; it resolves environments at run time and needs reachable channels.</w:t>
       </w:r>
     </w:p>
     <w:p>

</xml_diff>

<commit_message>
Make the isoform-level analyses work, and show their results
</commit_message>
<xml_diff>
--- a/rnaseq-flow_User_Guide.docx
+++ b/rnaseq-flow_User_Guide.docx
@@ -9267,7 +9267,7 @@
         <w:pStyle w:val="Heading2"/>
       </w:pPr>
       <w:r>
-        <w:t xml:space="preserve">8.12 Isoform switching - isoform_switch/</w:t>
+        <w:t xml:space="preserve">8.12 Isoform switching - isoform_switch_output/</w:t>
       </w:r>
     </w:p>
     <w:p>
@@ -9281,7 +9281,55 @@
           <w:i w:val="false"/>
           <w:iCs w:val="false"/>
         </w:rPr>
-        <w:t xml:space="preserve">isoform_switches.csv lists genes whose dominant transcript isoform changes between conditions even when total gene expression does not - biologically important and invisible to gene-level DE. Per-gene switch plots and the full analysis R object (switchList_analyzed.rds) are also written.</w:t>
+        <w:t xml:space="preserve">isoform_switches.csv lists the top 50 genes whose dominant transcript isoform changes between conditions even when total gene expression does not - biologically important and invisible to gene-level DE. Columns are gene_ref, gene_id, gene_name, condition_1, condition_2, gene_switch_q_value and Rank. switchList_analyzed.rds holds the whole switchAnalyzeRlist, for consequence prediction, ORF analysis or plotting other genes.</w:t>
+      </w:r>
+    </w:p>
+    <w:p>
+      <w:pPr>
+        <w:spacing w:after="120"/>
+      </w:pPr>
+      <w:r>
+        <w:rPr>
+          <w:b w:val="false"/>
+          <w:bCs w:val="false"/>
+          <w:i w:val="false"/>
+          <w:iCs w:val="false"/>
+        </w:rPr>
+        <w:t xml:space="preserve">Figures go in one subdirectory per condition pair, named &lt;condition&gt;_vs_REF to match rmats_output/ and the DE tables. Each holds the ten lowest q-values in that pair as PNG and SVG, ranked from 1 and zero-padded so the folder sorts by significance: 01_switch_plot_ENSG00000168710_aka_AHCYL1.svg and so on, with _aka_&lt;gene_name&gt; dropped where the annotation gives no symbol. A reproduce/ subfolder redraws any of them (section 8.16).</w:t>
+      </w:r>
+    </w:p>
+    <w:p>
+      <w:pPr>
+        <w:pBdr>
+          <w:left w:val="single" w:color="E0A800" w:sz="18" w:space="6"/>
+        </w:pBdr>
+        <w:shd w:fill="FFF4CE" w:val="clear"/>
+        <w:spacing w:after="140" w:before="80"/>
+        <w:ind w:left="160"/>
+      </w:pPr>
+      <w:r>
+        <w:rPr>
+          <w:b/>
+          <w:bCs/>
+        </w:rPr>
+        <w:t xml:space="preserve">Note  </w:t>
+      </w:r>
+      <w:r>
+        <w:t xml:space="preserve">isoform_switches.csv carries versioned gene IDs (ENSG00000168710.20), because IsoformSwitchAnalyzeR keeps the Ensembl version on gene_id while dtu_output/ and diffsplice_output/ read it bare from the GTF. Joining the three tables on gene_id matches nothing. The figure names and reproduce/switch_plot_genes.csv.gz use the bare form, and that table carries both.</w:t>
+      </w:r>
+    </w:p>
+    <w:p>
+      <w:pPr>
+        <w:spacing w:after="120"/>
+      </w:pPr>
+      <w:r>
+        <w:rPr>
+          <w:b w:val="false"/>
+          <w:bCs w:val="false"/>
+          <w:i w:val="false"/>
+          <w:iCs w:val="false"/>
+        </w:rPr>
+        <w:t xml:space="preserve">The effect size is dIF, the change in isoform fraction, computed as IF(condition_2) minus IF(condition_1). The baseline goes in condition_1, so in TGFb_vs_REF a positive dIF means that isoform takes a larger share of its gene's expression in TGFb: the same direction a positive log2FoldChange means in the DE tables beside it.</w:t>
       </w:r>
     </w:p>
     <w:p>
@@ -9498,7 +9546,21 @@
           <w:i w:val="false"/>
           <w:iCs w:val="false"/>
         </w:rPr>
-        <w:t xml:space="preserve">Use dtu_gene_qvalues.csv (gene_qvalue &lt; 0.05) to call genes with a significant usage change, then dtu_transcript_results.csv to see which transcripts of that gene drive the switch. Only multi-transcript, expressed genes are tested. DTU complements isoform switching and gene-level DE - a gene can show significant DTU while its total expression is unchanged.</w:t>
+        <w:t xml:space="preserve">Use dtu_gene_qvalues.csv (gene_qvalue &lt; 0.05) to call genes with a significant usage change, then dtu_transcript_results.csv to see which transcripts of that gene drive the switch, or read the same thing off that gene's figure. Only multi-transcript, expressed genes are tested. DTU complements isoform switching and gene-level DE - a gene can show significant DTU while its total expression is unchanged.</w:t>
+      </w:r>
+    </w:p>
+    <w:p>
+      <w:pPr>
+        <w:spacing w:after="120"/>
+      </w:pPr>
+      <w:r>
+        <w:rPr>
+          <w:b w:val="false"/>
+          <w:bCs w:val="false"/>
+          <w:i w:val="false"/>
+          <w:iCs w:val="false"/>
+        </w:rPr>
+        <w:t xml:space="preserve">The ten lowest gene_qvalue genes are drawn as PNG and SVG: &lt;rank&gt;_dtu_plot_&lt;gene&gt;_aka_&lt;gene_name&gt;, a bar per condition per transcript at that condition's mean isoform fraction, every sample drawn as a point on top, and transcripts at padj &lt; 0.05 starred in red. A reproduce/ subfolder redraws them (section 8.16). DEXSeq's own plotDEXSeq is not used: it is written for exon bins on genomic coordinates and cannot render a transcript-level object.</w:t>
       </w:r>
     </w:p>
     <w:p>
@@ -9715,7 +9777,21 @@
           <w:i w:val="false"/>
           <w:iCs w:val="false"/>
         </w:rPr>
-        <w:t xml:space="preserve">Use diffsplice_gene_results.csv (FDR &lt; 0.05) to find genes with a splicing change, then the per-feature table to see which exon or transcript drives it. The comparison column names the condition contrast; only multi-feature genes are tested. It complements rMATS (event-based) and DEXSeq DTU (transcript proportions) as a third, independent view of alternative splicing.</w:t>
+        <w:t xml:space="preserve">Use diffsplice_gene_results.csv (FDR &lt; 0.05) to find genes with a splicing change, then the per-feature table to see which exon or transcript drives it, or read the same thing off that gene's figure. The comparison column names the condition contrast; only multi-feature genes are tested. It complements rMATS (event-based) and DEXSeq DTU (transcript proportions) as a third, independent view of alternative splicing.</w:t>
+      </w:r>
+    </w:p>
+    <w:p>
+      <w:pPr>
+        <w:spacing w:after="120"/>
+      </w:pPr>
+      <w:r>
+        <w:rPr>
+          <w:b w:val="false"/>
+          <w:bCs w:val="false"/>
+          <w:i w:val="false"/>
+          <w:iCs w:val="false"/>
+        </w:rPr>
+        <w:t xml:space="preserve">Figures go in one subdirectory per contrast, named &lt;condition&gt;_vs_REF like rmats_output/. Each holds the ten lowest gene-level FDRs as PNG and SVG: &lt;rank&gt;_splice_plot_&lt;GeneID&gt;_aka_&lt;gene_name&gt;, which is plotSpliceDGE for that gene, every feature's log-fold-change against the gene's own, with features at FDR &lt; 0.05 marked in red and sized by how far below. A reproduce/ subfolder redraws them (section 8.16).</w:t>
       </w:r>
     </w:p>
     <w:p>
@@ -10165,6 +10241,165 @@
                 <w:sz w:val="19"/>
                 <w:szCs w:val="19"/>
               </w:rPr>
+              <w:t xml:space="preserve">Differential transcript usage</w:t>
+            </w:r>
+          </w:p>
+        </w:tc>
+        <w:tc>
+          <w:tcPr>
+            <w:tcW w:type="dxa" w:w="6760"/>
+            <w:shd w:fill="FFFFFF" w:val="clear"/>
+            <w:tcMar>
+              <w:top w:type="dxa" w:w="60"/>
+              <w:left w:type="dxa" w:w="110"/>
+              <w:bottom w:type="dxa" w:w="60"/>
+              <w:right w:type="dxa" w:w="110"/>
+            </w:tcMar>
+          </w:tcPr>
+          <w:p>
+            <w:r>
+              <w:rPr>
+                <w:b w:val="false"/>
+                <w:bCs w:val="false"/>
+                <w:color w:val="000000"/>
+                <w:sz w:val="19"/>
+                <w:szCs w:val="19"/>
+              </w:rPr>
+              <w:t xml:space="preserve">Rendered when --dtu ran: genes with a significant usage shift, a searchable table, and the per-gene isoform-usage figures</w:t>
+            </w:r>
+          </w:p>
+        </w:tc>
+      </w:tr>
+      <w:tr>
+        <w:trPr>
+          <w:tblHeader w:val="false"/>
+        </w:trPr>
+        <w:tc>
+          <w:tcPr>
+            <w:tcW w:type="dxa" w:w="2600"/>
+            <w:shd w:fill="FFFFFF" w:val="clear"/>
+            <w:tcMar>
+              <w:top w:type="dxa" w:w="60"/>
+              <w:left w:type="dxa" w:w="110"/>
+              <w:bottom w:type="dxa" w:w="60"/>
+              <w:right w:type="dxa" w:w="110"/>
+            </w:tcMar>
+          </w:tcPr>
+          <w:p>
+            <w:r>
+              <w:rPr>
+                <w:b w:val="false"/>
+                <w:bCs w:val="false"/>
+                <w:color w:val="000000"/>
+                <w:sz w:val="19"/>
+                <w:szCs w:val="19"/>
+              </w:rPr>
+              <w:t xml:space="preserve">Differential splicing</w:t>
+            </w:r>
+          </w:p>
+        </w:tc>
+        <w:tc>
+          <w:tcPr>
+            <w:tcW w:type="dxa" w:w="6760"/>
+            <w:shd w:fill="FFFFFF" w:val="clear"/>
+            <w:tcMar>
+              <w:top w:type="dxa" w:w="60"/>
+              <w:left w:type="dxa" w:w="110"/>
+              <w:bottom w:type="dxa" w:w="60"/>
+              <w:right w:type="dxa" w:w="110"/>
+            </w:tcMar>
+          </w:tcPr>
+          <w:p>
+            <w:r>
+              <w:rPr>
+                <w:b w:val="false"/>
+                <w:bCs w:val="false"/>
+                <w:color w:val="000000"/>
+                <w:sz w:val="19"/>
+                <w:szCs w:val="19"/>
+              </w:rPr>
+              <w:t xml:space="preserve">Rendered when --diffsplice ran: per-gene results at exon level on the genome aligners or transcript level on the pseudo-aligners, with the per-gene plotSpliceDGE figures</w:t>
+            </w:r>
+          </w:p>
+        </w:tc>
+      </w:tr>
+      <w:tr>
+        <w:trPr>
+          <w:tblHeader w:val="false"/>
+        </w:trPr>
+        <w:tc>
+          <w:tcPr>
+            <w:tcW w:type="dxa" w:w="2600"/>
+            <w:shd w:fill="FFFFFF" w:val="clear"/>
+            <w:tcMar>
+              <w:top w:type="dxa" w:w="60"/>
+              <w:left w:type="dxa" w:w="110"/>
+              <w:bottom w:type="dxa" w:w="60"/>
+              <w:right w:type="dxa" w:w="110"/>
+            </w:tcMar>
+          </w:tcPr>
+          <w:p>
+            <w:r>
+              <w:rPr>
+                <w:b w:val="false"/>
+                <w:bCs w:val="false"/>
+                <w:color w:val="000000"/>
+                <w:sz w:val="19"/>
+                <w:szCs w:val="19"/>
+              </w:rPr>
+              <w:t xml:space="preserve">Isoform switching</w:t>
+            </w:r>
+          </w:p>
+        </w:tc>
+        <w:tc>
+          <w:tcPr>
+            <w:tcW w:type="dxa" w:w="6760"/>
+            <w:shd w:fill="FFFFFF" w:val="clear"/>
+            <w:tcMar>
+              <w:top w:type="dxa" w:w="60"/>
+              <w:left w:type="dxa" w:w="110"/>
+              <w:bottom w:type="dxa" w:w="60"/>
+              <w:right w:type="dxa" w:w="110"/>
+            </w:tcMar>
+          </w:tcPr>
+          <w:p>
+            <w:r>
+              <w:rPr>
+                <w:b w:val="false"/>
+                <w:bCs w:val="false"/>
+                <w:color w:val="000000"/>
+                <w:sz w:val="19"/>
+                <w:szCs w:val="19"/>
+              </w:rPr>
+              <w:t xml:space="preserve">Rendered when --isoform_switch ran: the switching genes, their q-values, and the per-gene switch plots</w:t>
+            </w:r>
+          </w:p>
+        </w:tc>
+      </w:tr>
+      <w:tr>
+        <w:trPr>
+          <w:tblHeader w:val="false"/>
+        </w:trPr>
+        <w:tc>
+          <w:tcPr>
+            <w:tcW w:type="dxa" w:w="2600"/>
+            <w:shd w:fill="FFFFFF" w:val="clear"/>
+            <w:tcMar>
+              <w:top w:type="dxa" w:w="60"/>
+              <w:left w:type="dxa" w:w="110"/>
+              <w:bottom w:type="dxa" w:w="60"/>
+              <w:right w:type="dxa" w:w="110"/>
+            </w:tcMar>
+          </w:tcPr>
+          <w:p>
+            <w:r>
+              <w:rPr>
+                <w:b w:val="false"/>
+                <w:bCs w:val="false"/>
+                <w:color w:val="000000"/>
+                <w:sz w:val="19"/>
+                <w:szCs w:val="19"/>
+              </w:rPr>
               <w:t xml:space="preserve">Functional enrichment</w:t>
             </w:r>
           </w:p>
@@ -10286,7 +10521,7 @@
           <w:i w:val="false"/>
           <w:iCs w:val="false"/>
         </w:rPr>
-        <w:t xml:space="preserve">Every figure the pipeline publishes can be redrawn, and adapted, from the results directory alone: no rerunning, no access to the original compute, no digging through work/. Each analysis output directory (deseq2_output/, edger_output/, gsea_output/, gprofiler_output/) carries a reproduce/ subfolder holding a standalone R script per figure type, gzipped copies of the tables behind each figure, and the R objects a plot genuinely needs, always the smallest that will do. The parent folder is for reading and reproduce/ is for running: parent CSVs stay uncompressed so they open by double-click, while the reproduce/ copies are gzipped, which R reads transparently.</w:t>
+        <w:t xml:space="preserve">Every figure the pipeline publishes can be redrawn, and adapted, from the results directory alone: no rerunning, no access to the original compute, no digging through work/. Each of deseq2_output/, edger_output/, gsea_output/, gprofiler_output/, isoform_switch_output/, dtu_output/ and diffsplice_output/ carries a reproduce/ subfolder holding a standalone R script per figure type, gzipped copies of the tables behind each figure, and the R objects a plot genuinely needs, always the smallest that will do. The parent folder is for reading and reproduce/ is for running: parent CSVs stay uncompressed so they open by double-click, while the reproduce/ copies are gzipped, which R reads transparently.</w:t>
       </w:r>
     </w:p>
     <w:tbl>
@@ -10607,7 +10842,7 @@
         <w:t xml:space="preserve">Note  </w:t>
       </w:r>
       <w:r>
-        <w:t xml:space="preserve">isoform_switch/ is outside these conventions. IsoformSwitchAnalyzeR writes its own figures, so they are PNG-only and have no reproduce/ folder.</w:t>
+        <w:t xml:space="preserve">rmats_output/ and star_fusion/ have no reproduce/ folder, because neither step produces a figure: rMATS and STAR-Fusion emit tables only.</w:t>
       </w:r>
     </w:p>
     <w:p>

</xml_diff>